<commit_message>
script(video): Hebrew narration as recorded on 2026-10-02
Scene 6's detail line and scene 7's closing line (naming the item map and
the table) reworded; the patient and email lines as read in the new takes.
Two typos fixed: 'וזמבחינת' → 'ומבחינת', and a stray space before the
period in 'הקישור .'.
</commit_message>
<xml_diff>
--- a/guides/video/intro/SCRIPT.he.docx
+++ b/guides/video/intro/SCRIPT.he.docx
@@ -305,10 +305,52 @@
       </w:r>
       <w:r>
         <w:rPr>
-          <w:rFonts w:ascii="Arial" w:hAnsi="Arial" w:eastAsia="Arial"/>
-          <w:rtl w:val="true"/>
-        </w:rPr>
-        <w:t xml:space="preserve"> הסימן | בתוך שורת קריינות מסמן מעבר בין כתוביות; הוא אינו מוקרא.</w:t>
+          <w:rFonts w:eastAsia="Arial"/>
+          <w:rtl w:val="true"/>
+        </w:rPr>
+        <w:t xml:space="preserve"> </w:t>
+      </w:r>
+      <w:r>
+        <w:rPr>
+          <w:rFonts w:ascii="Arial" w:hAnsi="Arial" w:eastAsia="Arial"/>
+          <w:rtl w:val="true"/>
+        </w:rPr>
+        <w:t xml:space="preserve">הסימן </w:t>
+      </w:r>
+      <w:r>
+        <w:rPr>
+          <w:rFonts w:eastAsia="Arial"/>
+          <w:rtl w:val="true"/>
+        </w:rPr>
+        <w:t xml:space="preserve">| </w:t>
+      </w:r>
+      <w:r>
+        <w:rPr>
+          <w:rFonts w:ascii="Arial" w:hAnsi="Arial" w:eastAsia="Arial"/>
+          <w:rtl w:val="true"/>
+        </w:rPr>
+        <w:t>בתוך שורת קריינות מסמן מעבר בין כתוביות</w:t>
+      </w:r>
+      <w:r>
+        <w:rPr>
+          <w:rFonts w:eastAsia="Arial"/>
+          <w:rtl w:val="true"/>
+        </w:rPr>
+        <w:t xml:space="preserve">; </w:t>
+      </w:r>
+      <w:r>
+        <w:rPr>
+          <w:rFonts w:ascii="Arial" w:hAnsi="Arial" w:eastAsia="Arial"/>
+          <w:rtl w:val="true"/>
+        </w:rPr>
+        <w:t>הוא אינו מוקרא</w:t>
+      </w:r>
+      <w:r>
+        <w:rPr>
+          <w:rFonts w:eastAsia="Arial"/>
+          <w:rtl w:val="true"/>
+        </w:rPr>
+        <w:t>.</w:t>
       </w:r>
     </w:p>
     <w:p>
@@ -1053,7 +1095,28 @@
           <w:rFonts w:ascii="Arial" w:hAnsi="Arial" w:eastAsia="Arial"/>
           <w:rtl w:val="true"/>
         </w:rPr>
-        <w:t xml:space="preserve">כדי לשלוח שאלון למטופל, | פותחים את מחולל הקישורים.</w:t>
+        <w:t>כדי לשלוח שאלון למטופל</w:t>
+      </w:r>
+      <w:r>
+        <w:rPr>
+          <w:rFonts w:eastAsia="Arial"/>
+          <w:rtl w:val="true"/>
+        </w:rPr>
+        <w:t xml:space="preserve">, | </w:t>
+      </w:r>
+      <w:r>
+        <w:rPr>
+          <w:rFonts w:ascii="Arial" w:hAnsi="Arial" w:eastAsia="Arial"/>
+          <w:rtl w:val="true"/>
+        </w:rPr>
+        <w:t>פותחים את מחולל הקישורים</w:t>
+      </w:r>
+      <w:r>
+        <w:rPr>
+          <w:rFonts w:eastAsia="Arial"/>
+          <w:rtl w:val="true"/>
+        </w:rPr>
+        <w:t>.</w:t>
       </w:r>
     </w:p>
     <w:p>
@@ -1081,7 +1144,56 @@
           <w:rFonts w:ascii="Arial" w:hAnsi="Arial" w:eastAsia="Arial"/>
           <w:rtl w:val="true"/>
         </w:rPr>
-        <w:t xml:space="preserve">מחכים לכם עשרות שאלונים: | לחרדה, לדיכאון, | לטראומה ועוד.</w:t>
+        <w:t>מחכים לכם עשרות שאלונים</w:t>
+      </w:r>
+      <w:r>
+        <w:rPr>
+          <w:rFonts w:eastAsia="Arial"/>
+          <w:rtl w:val="true"/>
+        </w:rPr>
+        <w:t xml:space="preserve">: | </w:t>
+      </w:r>
+      <w:r>
+        <w:rPr>
+          <w:rFonts w:ascii="Arial" w:hAnsi="Arial" w:eastAsia="Arial"/>
+          <w:rtl w:val="true"/>
+        </w:rPr>
+        <w:t>לחרדה</w:t>
+      </w:r>
+      <w:r>
+        <w:rPr>
+          <w:rFonts w:eastAsia="Arial"/>
+          <w:rtl w:val="true"/>
+        </w:rPr>
+        <w:t xml:space="preserve">, </w:t>
+      </w:r>
+      <w:r>
+        <w:rPr>
+          <w:rFonts w:ascii="Arial" w:hAnsi="Arial" w:eastAsia="Arial"/>
+          <w:rtl w:val="true"/>
+        </w:rPr>
+        <w:t>לדיכאון</w:t>
+      </w:r>
+      <w:r>
+        <w:rPr>
+          <w:rFonts w:eastAsia="Arial"/>
+          <w:rtl w:val="true"/>
+        </w:rPr>
+        <w:t xml:space="preserve">, | </w:t>
+      </w:r>
+      <w:r>
+        <w:rPr>
+          <w:rFonts w:ascii="Arial" w:hAnsi="Arial" w:eastAsia="Arial"/>
+          <w:rtl w:val="true"/>
+        </w:rPr>
+        <w:t>לטראומה ועוד</w:t>
+      </w:r>
+      <w:r>
+        <w:rPr>
+          <w:rFonts w:eastAsia="Arial"/>
+          <w:rtl w:val="true"/>
+        </w:rPr>
+        <w:t>.</w:t>
       </w:r>
     </w:p>
     <w:p>
@@ -1109,7 +1221,70 @@
           <w:rFonts w:ascii="Arial" w:hAnsi="Arial" w:eastAsia="Arial"/>
           <w:rtl w:val="true"/>
         </w:rPr>
-        <w:t xml:space="preserve">מחפשים "הכשרה", | בוחרים את הסוללה שלכם, | ואפשר גם להוסיף | שאלונים נוספים.</w:t>
+        <w:t xml:space="preserve">מחפשים </w:t>
+      </w:r>
+      <w:r>
+        <w:rPr>
+          <w:rFonts w:eastAsia="Arial"/>
+          <w:rtl w:val="true"/>
+        </w:rPr>
+        <w:t>"</w:t>
+      </w:r>
+      <w:r>
+        <w:rPr>
+          <w:rFonts w:ascii="Arial" w:hAnsi="Arial" w:eastAsia="Arial"/>
+          <w:rtl w:val="true"/>
+        </w:rPr>
+        <w:t>הכשרה</w:t>
+      </w:r>
+      <w:r>
+        <w:rPr>
+          <w:rFonts w:eastAsia="Arial"/>
+          <w:rtl w:val="true"/>
+        </w:rPr>
+        <w:t xml:space="preserve">", | </w:t>
+      </w:r>
+      <w:r>
+        <w:rPr>
+          <w:rFonts w:ascii="Arial" w:hAnsi="Arial" w:eastAsia="Arial"/>
+          <w:rtl w:val="true"/>
+        </w:rPr>
+        <w:t>בוחרים את הסוללה שלכם</w:t>
+      </w:r>
+      <w:r>
+        <w:rPr>
+          <w:rFonts w:eastAsia="Arial"/>
+          <w:rtl w:val="true"/>
+        </w:rPr>
+        <w:t xml:space="preserve">, | </w:t>
+      </w:r>
+      <w:r>
+        <w:rPr>
+          <w:rFonts w:ascii="Arial" w:hAnsi="Arial" w:eastAsia="Arial"/>
+          <w:rtl w:val="true"/>
+        </w:rPr>
+        <w:t xml:space="preserve">ואפשר גם להוסיף </w:t>
+      </w:r>
+      <w:r>
+        <w:rPr>
+          <w:rFonts w:eastAsia="Arial"/>
+          <w:rtl w:val="true"/>
+        </w:rPr>
+        <w:t xml:space="preserve">| </w:t>
+      </w:r>
+      <w:r>
+        <w:rPr>
+          <w:rFonts w:ascii="Arial" w:hAnsi="Arial" w:eastAsia="Arial"/>
+          <w:rtl w:val="true"/>
+        </w:rPr>
+        <w:t>שאלונים נוספים</w:t>
+      </w:r>
+      <w:r>
+        <w:rPr>
+          <w:rFonts w:eastAsia="Arial"/>
+          <w:rtl w:val="true"/>
+        </w:rPr>
+        <w:t>.</w:t>
       </w:r>
     </w:p>
     <w:p>
@@ -1376,7 +1551,56 @@
           <w:rFonts w:ascii="Arial" w:hAnsi="Arial" w:eastAsia="Arial"/>
           <w:rtl w:val="true"/>
         </w:rPr>
-        <w:t xml:space="preserve">מזינים את מזהה המטופל | שקיבלתם, | וברגע שההקלדה מסתיימת, | הקישור מוכן.</w:t>
+        <w:t xml:space="preserve">מזינים את מזהה המטופל </w:t>
+      </w:r>
+      <w:r>
+        <w:rPr>
+          <w:rFonts w:eastAsia="Arial"/>
+          <w:rtl w:val="true"/>
+        </w:rPr>
+        <w:t xml:space="preserve">| </w:t>
+      </w:r>
+      <w:r>
+        <w:rPr>
+          <w:rFonts w:ascii="Arial" w:hAnsi="Arial" w:eastAsia="Arial"/>
+          <w:rtl w:val="true"/>
+        </w:rPr>
+        <w:t>שקיבלתם</w:t>
+      </w:r>
+      <w:r>
+        <w:rPr>
+          <w:rFonts w:eastAsia="Arial"/>
+          <w:rtl w:val="true"/>
+        </w:rPr>
+        <w:t xml:space="preserve">, | </w:t>
+      </w:r>
+      <w:r>
+        <w:rPr>
+          <w:rFonts w:ascii="Arial" w:hAnsi="Arial" w:eastAsia="Arial"/>
+          <w:rtl w:val="true"/>
+        </w:rPr>
+        <w:t>וברגע שההקלדה מסתיימת</w:t>
+      </w:r>
+      <w:r>
+        <w:rPr>
+          <w:rFonts w:eastAsia="Arial"/>
+          <w:rtl w:val="true"/>
+        </w:rPr>
+        <w:t xml:space="preserve">, | </w:t>
+      </w:r>
+      <w:r>
+        <w:rPr>
+          <w:rFonts w:ascii="Arial" w:hAnsi="Arial" w:eastAsia="Arial"/>
+          <w:rtl w:val="true"/>
+        </w:rPr>
+        <w:t>הקישור מוכן</w:t>
+      </w:r>
+      <w:r>
+        <w:rPr>
+          <w:rFonts w:eastAsia="Arial"/>
+          <w:rtl w:val="true"/>
+        </w:rPr>
+        <w:t>.</w:t>
       </w:r>
     </w:p>
     <w:p>
@@ -1623,7 +1847,48 @@
           <w:rFonts w:ascii="Arial" w:hAnsi="Arial" w:eastAsia="Arial"/>
           <w:rtl w:val="true"/>
         </w:rPr>
-        <w:t xml:space="preserve">לוחצים על קוד QR, | והמטופל סורק אותו | במצלמת הטלפון.</w:t>
+        <w:t xml:space="preserve">לוחצים על קוד </w:t>
+      </w:r>
+      <w:r>
+        <w:rPr>
+          <w:rFonts w:eastAsia="Arial"/>
+        </w:rPr>
+        <w:t>QR</w:t>
+      </w:r>
+      <w:r>
+        <w:rPr>
+          <w:rFonts w:eastAsia="Arial"/>
+          <w:rtl w:val="true"/>
+        </w:rPr>
+        <w:t xml:space="preserve">, | </w:t>
+      </w:r>
+      <w:r>
+        <w:rPr>
+          <w:rFonts w:ascii="Arial" w:hAnsi="Arial" w:eastAsia="Arial"/>
+          <w:rtl w:val="true"/>
+        </w:rPr>
+        <w:t xml:space="preserve">והמטופל סורק אותו </w:t>
+      </w:r>
+      <w:r>
+        <w:rPr>
+          <w:rFonts w:eastAsia="Arial"/>
+          <w:rtl w:val="true"/>
+        </w:rPr>
+        <w:t xml:space="preserve">| </w:t>
+      </w:r>
+      <w:r>
+        <w:rPr>
+          <w:rFonts w:ascii="Arial" w:hAnsi="Arial" w:eastAsia="Arial"/>
+          <w:rtl w:val="true"/>
+        </w:rPr>
+        <w:t>במצלמת הטלפון</w:t>
+      </w:r>
+      <w:r>
+        <w:rPr>
+          <w:rFonts w:eastAsia="Arial"/>
+          <w:rtl w:val="true"/>
+        </w:rPr>
+        <w:t>.</w:t>
       </w:r>
     </w:p>
     <w:p>
@@ -1651,7 +1916,42 @@
           <w:rFonts w:ascii="Arial" w:hAnsi="Arial" w:eastAsia="Arial"/>
           <w:rtl w:val="true"/>
         </w:rPr>
-        <w:t xml:space="preserve">זהו. | אין צורך להתקין אפליקציה | או ליצור חשבון.</w:t>
+        <w:t>זהו</w:t>
+      </w:r>
+      <w:r>
+        <w:rPr>
+          <w:rFonts w:eastAsia="Arial"/>
+          <w:rtl w:val="true"/>
+        </w:rPr>
+        <w:t xml:space="preserve">. | </w:t>
+      </w:r>
+      <w:r>
+        <w:rPr>
+          <w:rFonts w:ascii="Arial" w:hAnsi="Arial" w:eastAsia="Arial"/>
+          <w:rtl w:val="true"/>
+        </w:rPr>
+        <w:t xml:space="preserve">אין צורך להתקין אפליקציה </w:t>
+      </w:r>
+      <w:r>
+        <w:rPr>
+          <w:rFonts w:eastAsia="Arial"/>
+          <w:rtl w:val="true"/>
+        </w:rPr>
+        <w:t xml:space="preserve">| </w:t>
+      </w:r>
+      <w:r>
+        <w:rPr>
+          <w:rFonts w:ascii="Arial" w:hAnsi="Arial" w:eastAsia="Arial"/>
+          <w:rtl w:val="true"/>
+        </w:rPr>
+        <w:t>או ליצור חשבון</w:t>
+      </w:r>
+      <w:r>
+        <w:rPr>
+          <w:rFonts w:eastAsia="Arial"/>
+          <w:rtl w:val="true"/>
+        </w:rPr>
+        <w:t>.</w:t>
       </w:r>
     </w:p>
     <w:p>
@@ -1953,7 +2253,42 @@
           <w:rFonts w:ascii="Arial" w:hAnsi="Arial" w:eastAsia="Arial"/>
           <w:rtl w:val="true"/>
         </w:rPr>
-        <w:t xml:space="preserve">המטופל לוחץ על התחלה, | קורא הנחיות קצרות | ומתחיל לענות.</w:t>
+        <w:t>המטופל לוחץ על התחלה</w:t>
+      </w:r>
+      <w:r>
+        <w:rPr>
+          <w:rFonts w:eastAsia="Arial"/>
+          <w:rtl w:val="true"/>
+        </w:rPr>
+        <w:t xml:space="preserve">, | </w:t>
+      </w:r>
+      <w:r>
+        <w:rPr>
+          <w:rFonts w:ascii="Arial" w:hAnsi="Arial" w:eastAsia="Arial"/>
+          <w:rtl w:val="true"/>
+        </w:rPr>
+        <w:t xml:space="preserve">קורא הנחיות קצרות </w:t>
+      </w:r>
+      <w:r>
+        <w:rPr>
+          <w:rFonts w:eastAsia="Arial"/>
+          <w:rtl w:val="true"/>
+        </w:rPr>
+        <w:t xml:space="preserve">| </w:t>
+      </w:r>
+      <w:r>
+        <w:rPr>
+          <w:rFonts w:ascii="Arial" w:hAnsi="Arial" w:eastAsia="Arial"/>
+          <w:rtl w:val="true"/>
+        </w:rPr>
+        <w:t>ומתחיל לענות</w:t>
+      </w:r>
+      <w:r>
+        <w:rPr>
+          <w:rFonts w:eastAsia="Arial"/>
+          <w:rtl w:val="true"/>
+        </w:rPr>
+        <w:t>.</w:t>
       </w:r>
     </w:p>
     <w:p>
@@ -1981,7 +2316,28 @@
           <w:rFonts w:ascii="Arial" w:hAnsi="Arial" w:eastAsia="Arial"/>
           <w:rtl w:val="true"/>
         </w:rPr>
-        <w:t xml:space="preserve">בכל פעם מוצגת שאלה אחת. | עונים,</w:t>
+        <w:t>בכל פעם מוצגת שאלה אחת</w:t>
+      </w:r>
+      <w:r>
+        <w:rPr>
+          <w:rFonts w:eastAsia="Arial"/>
+          <w:rtl w:val="true"/>
+        </w:rPr>
+        <w:t xml:space="preserve">. | </w:t>
+      </w:r>
+      <w:r>
+        <w:rPr>
+          <w:rFonts w:ascii="Arial" w:hAnsi="Arial" w:eastAsia="Arial"/>
+          <w:rtl w:val="true"/>
+        </w:rPr>
+        <w:t>עונים</w:t>
+      </w:r>
+      <w:r>
+        <w:rPr>
+          <w:rFonts w:eastAsia="Arial"/>
+          <w:rtl w:val="true"/>
+        </w:rPr>
+        <w:t>,</w:t>
       </w:r>
     </w:p>
     <w:p>
@@ -2009,7 +2365,14 @@
           <w:rFonts w:ascii="Arial" w:hAnsi="Arial" w:eastAsia="Arial"/>
           <w:rtl w:val="true"/>
         </w:rPr>
-        <w:t xml:space="preserve">וממשיכים לשאלה הבאה.</w:t>
+        <w:t>וממשיכים לשאלה הבאה</w:t>
+      </w:r>
+      <w:r>
+        <w:rPr>
+          <w:rFonts w:eastAsia="Arial"/>
+          <w:rtl w:val="true"/>
+        </w:rPr>
+        <w:t>.</w:t>
       </w:r>
     </w:p>
     <w:p>
@@ -2050,7 +2413,70 @@
           <w:rFonts w:ascii="Arial" w:hAnsi="Arial" w:eastAsia="Arial"/>
           <w:rtl w:val="true"/>
         </w:rPr>
-        <w:t xml:space="preserve">בסיום, | מופיעים הציונים | ואישור שהתוצאות נשלחו. | וזה הכול מבחינת המטופל.</w:t>
+        <w:t>בסיום</w:t>
+      </w:r>
+      <w:r>
+        <w:rPr>
+          <w:rFonts w:eastAsia="Arial"/>
+          <w:rtl w:val="true"/>
+        </w:rPr>
+        <w:t xml:space="preserve">, | </w:t>
+      </w:r>
+      <w:r>
+        <w:rPr>
+          <w:rFonts w:ascii="Arial" w:hAnsi="Arial" w:eastAsia="Arial"/>
+          <w:rtl w:val="true"/>
+        </w:rPr>
+        <w:t xml:space="preserve">מופיעים הציונים </w:t>
+      </w:r>
+      <w:r>
+        <w:rPr>
+          <w:rFonts w:eastAsia="Arial"/>
+          <w:rtl w:val="true"/>
+        </w:rPr>
+        <w:t xml:space="preserve">| </w:t>
+      </w:r>
+      <w:r>
+        <w:rPr>
+          <w:rFonts w:ascii="Arial" w:hAnsi="Arial" w:eastAsia="Arial"/>
+          <w:rtl w:val="true"/>
+        </w:rPr>
+        <w:t>ואישור שהתוצאות נשלחו</w:t>
+      </w:r>
+      <w:r>
+        <w:rPr>
+          <w:rFonts w:eastAsia="Arial"/>
+          <w:rtl w:val="true"/>
+        </w:rPr>
+        <w:t xml:space="preserve">. | </w:t>
+      </w:r>
+      <w:r>
+        <w:rPr>
+          <w:rFonts w:ascii="Arial" w:hAnsi="Arial" w:eastAsia="Arial"/>
+          <w:rtl w:val="true"/>
+        </w:rPr>
+        <w:t>ומבחינת המטופל</w:t>
+      </w:r>
+      <w:r>
+        <w:rPr>
+          <w:rFonts w:eastAsia="Arial"/>
+          <w:rtl w:val="true"/>
+        </w:rPr>
+        <w:t xml:space="preserve">, </w:t>
+      </w:r>
+      <w:r>
+        <w:rPr>
+          <w:rFonts w:ascii="Arial" w:hAnsi="Arial" w:eastAsia="Arial"/>
+          <w:rtl w:val="true"/>
+        </w:rPr>
+        <w:t>זה הכל</w:t>
+      </w:r>
+      <w:r>
+        <w:rPr>
+          <w:rFonts w:eastAsia="Arial"/>
+          <w:rtl w:val="true"/>
+        </w:rPr>
+        <w:t>.</w:t>
       </w:r>
     </w:p>
     <w:p>
@@ -2323,7 +2749,56 @@
           <w:rFonts w:ascii="Arial" w:hAnsi="Arial" w:eastAsia="Arial"/>
           <w:rtl w:val="true"/>
         </w:rPr>
-        <w:t xml:space="preserve">כשהמטופל מסיים, | מתקבל אצלכם אימייל | עם המזהה שלו | וקישור לסיכום.</w:t>
+        <w:t>כשהמטופל מסיים</w:t>
+      </w:r>
+      <w:r>
+        <w:rPr>
+          <w:rFonts w:eastAsia="Arial"/>
+          <w:rtl w:val="true"/>
+        </w:rPr>
+        <w:t xml:space="preserve">, | </w:t>
+      </w:r>
+      <w:r>
+        <w:rPr>
+          <w:rFonts w:ascii="Arial" w:hAnsi="Arial" w:eastAsia="Arial"/>
+          <w:rtl w:val="true"/>
+        </w:rPr>
+        <w:t xml:space="preserve">מתקבל אצלכם אימייל </w:t>
+      </w:r>
+      <w:r>
+        <w:rPr>
+          <w:rFonts w:eastAsia="Arial"/>
+          <w:rtl w:val="true"/>
+        </w:rPr>
+        <w:t xml:space="preserve">| </w:t>
+      </w:r>
+      <w:r>
+        <w:rPr>
+          <w:rFonts w:ascii="Arial" w:hAnsi="Arial" w:eastAsia="Arial"/>
+          <w:rtl w:val="true"/>
+        </w:rPr>
+        <w:t xml:space="preserve">עם המזהה שלו </w:t>
+      </w:r>
+      <w:r>
+        <w:rPr>
+          <w:rFonts w:eastAsia="Arial"/>
+          <w:rtl w:val="true"/>
+        </w:rPr>
+        <w:t xml:space="preserve">| </w:t>
+      </w:r>
+      <w:r>
+        <w:rPr>
+          <w:rFonts w:ascii="Arial" w:hAnsi="Arial" w:eastAsia="Arial"/>
+          <w:rtl w:val="true"/>
+        </w:rPr>
+        <w:t>וקישור לסיכום</w:t>
+      </w:r>
+      <w:r>
+        <w:rPr>
+          <w:rFonts w:eastAsia="Arial"/>
+          <w:rtl w:val="true"/>
+        </w:rPr>
+        <w:t>.</w:t>
       </w:r>
     </w:p>
     <w:p>
@@ -2351,7 +2826,28 @@
           <w:rFonts w:ascii="Arial" w:hAnsi="Arial" w:eastAsia="Arial"/>
           <w:rtl w:val="true"/>
         </w:rPr>
-        <w:t xml:space="preserve">לוחצים על הקישור | כדי לצפות בסיכום.</w:t>
+        <w:t xml:space="preserve">כדי לצפות בסיכום </w:t>
+      </w:r>
+      <w:r>
+        <w:rPr>
+          <w:rFonts w:eastAsia="Arial"/>
+          <w:rtl w:val="true"/>
+        </w:rPr>
+        <w:t xml:space="preserve">| </w:t>
+      </w:r>
+      <w:r>
+        <w:rPr>
+          <w:rFonts w:ascii="Arial" w:hAnsi="Arial" w:eastAsia="Arial"/>
+          <w:rtl w:val="true"/>
+        </w:rPr>
+        <w:t xml:space="preserve">לוחצים על הקישור</w:t>
+      </w:r>
+      <w:r>
+        <w:rPr>
+          <w:rFonts w:eastAsia="Arial"/>
+          <w:rtl w:val="true"/>
+        </w:rPr>
+        <w:t>.</w:t>
       </w:r>
     </w:p>
     <w:p>
@@ -2722,7 +3218,42 @@
           <w:rFonts w:ascii="Arial" w:hAnsi="Arial" w:eastAsia="Arial"/>
           <w:rtl w:val="true"/>
         </w:rPr>
-        <w:t xml:space="preserve">בסיכום, כל שאלון | מקבל כרטיס משלו.</w:t>
+        <w:t>בסיכום</w:t>
+      </w:r>
+      <w:r>
+        <w:rPr>
+          <w:rFonts w:eastAsia="Arial"/>
+          <w:rtl w:val="true"/>
+        </w:rPr>
+        <w:t xml:space="preserve">, </w:t>
+      </w:r>
+      <w:r>
+        <w:rPr>
+          <w:rFonts w:ascii="Arial" w:hAnsi="Arial" w:eastAsia="Arial"/>
+          <w:rtl w:val="true"/>
+        </w:rPr>
+        <w:t xml:space="preserve">כל שאלון </w:t>
+      </w:r>
+      <w:r>
+        <w:rPr>
+          <w:rFonts w:eastAsia="Arial"/>
+          <w:rtl w:val="true"/>
+        </w:rPr>
+        <w:t xml:space="preserve">| </w:t>
+      </w:r>
+      <w:r>
+        <w:rPr>
+          <w:rFonts w:ascii="Arial" w:hAnsi="Arial" w:eastAsia="Arial"/>
+          <w:rtl w:val="true"/>
+        </w:rPr>
+        <w:t>מקבל כרטיס משלו</w:t>
+      </w:r>
+      <w:r>
+        <w:rPr>
+          <w:rFonts w:eastAsia="Arial"/>
+          <w:rtl w:val="true"/>
+        </w:rPr>
+        <w:t>.</w:t>
       </w:r>
     </w:p>
     <w:p>
@@ -2750,7 +3281,55 @@
           <w:rFonts w:ascii="Arial" w:hAnsi="Arial" w:eastAsia="Arial"/>
           <w:rtl w:val="true"/>
         </w:rPr>
-        <w:t xml:space="preserve">אצל המטופל שלנו, | כבר במפגש הראשון, | יש טבעת סביב הנקודה | של הPHQ-9</w:t>
+        <w:t>אצל המטופל שלנו</w:t>
+      </w:r>
+      <w:r>
+        <w:rPr>
+          <w:rFonts w:eastAsia="Arial"/>
+          <w:rtl w:val="true"/>
+        </w:rPr>
+        <w:t xml:space="preserve">, | </w:t>
+      </w:r>
+      <w:r>
+        <w:rPr>
+          <w:rFonts w:ascii="Arial" w:hAnsi="Arial" w:eastAsia="Arial"/>
+          <w:rtl w:val="true"/>
+        </w:rPr>
+        <w:t>כבר במפגש הראשון</w:t>
+      </w:r>
+      <w:r>
+        <w:rPr>
+          <w:rFonts w:eastAsia="Arial"/>
+          <w:rtl w:val="true"/>
+        </w:rPr>
+        <w:t xml:space="preserve">, | </w:t>
+      </w:r>
+      <w:r>
+        <w:rPr>
+          <w:rFonts w:ascii="Arial" w:hAnsi="Arial" w:eastAsia="Arial"/>
+          <w:rtl w:val="true"/>
+        </w:rPr>
+        <w:t xml:space="preserve">יש טבעת סביב הנקודה </w:t>
+      </w:r>
+      <w:r>
+        <w:rPr>
+          <w:rFonts w:eastAsia="Arial"/>
+          <w:rtl w:val="true"/>
+        </w:rPr>
+        <w:t xml:space="preserve">| </w:t>
+      </w:r>
+      <w:r>
+        <w:rPr>
+          <w:rFonts w:ascii="Arial" w:hAnsi="Arial" w:eastAsia="Arial"/>
+          <w:rtl w:val="true"/>
+        </w:rPr>
+        <w:t>של ה</w:t>
+      </w:r>
+      <w:r>
+        <w:rPr>
+          <w:rFonts w:eastAsia="Arial"/>
+        </w:rPr>
+        <w:t>PHQ-9</w:t>
       </w:r>
     </w:p>
     <w:p>
@@ -2778,7 +3357,28 @@
           <w:rFonts w:ascii="Arial" w:hAnsi="Arial" w:eastAsia="Arial"/>
           <w:rtl w:val="true"/>
         </w:rPr>
-        <w:t xml:space="preserve">שמסמנת התראה | שדורשת תשומת לב.</w:t>
+        <w:t xml:space="preserve">שמסמנת התראה </w:t>
+      </w:r>
+      <w:r>
+        <w:rPr>
+          <w:rFonts w:eastAsia="Arial"/>
+          <w:rtl w:val="true"/>
+        </w:rPr>
+        <w:t xml:space="preserve">| </w:t>
+      </w:r>
+      <w:r>
+        <w:rPr>
+          <w:rFonts w:ascii="Arial" w:hAnsi="Arial" w:eastAsia="Arial"/>
+          <w:rtl w:val="true"/>
+        </w:rPr>
+        <w:t>שדורשת תשומת לב</w:t>
+      </w:r>
+      <w:r>
+        <w:rPr>
+          <w:rFonts w:eastAsia="Arial"/>
+          <w:rtl w:val="true"/>
+        </w:rPr>
+        <w:t>.</w:t>
       </w:r>
     </w:p>
     <w:p>
@@ -2806,7 +3406,63 @@
           <w:rFonts w:ascii="Arial" w:hAnsi="Arial" w:eastAsia="Arial"/>
           <w:rtl w:val="true"/>
         </w:rPr>
-        <w:t xml:space="preserve">לחיצה על הנקודה | פותחת את השאלון, | ההתראה וכל התשובות | מאותו מפגש.</w:t>
+        <w:t xml:space="preserve">לחיצה על הנקודה </w:t>
+      </w:r>
+      <w:r>
+        <w:rPr>
+          <w:rFonts w:eastAsia="Arial"/>
+          <w:rtl w:val="true"/>
+        </w:rPr>
+        <w:t xml:space="preserve">| </w:t>
+      </w:r>
+      <w:r>
+        <w:rPr>
+          <w:rFonts w:ascii="Arial" w:hAnsi="Arial" w:eastAsia="Arial"/>
+          <w:rtl w:val="true"/>
+        </w:rPr>
+        <w:t>פותחת את השאלון</w:t>
+      </w:r>
+      <w:r>
+        <w:rPr>
+          <w:rFonts w:eastAsia="Arial"/>
+          <w:rtl w:val="true"/>
+        </w:rPr>
+        <w:t xml:space="preserve">, | </w:t>
+      </w:r>
+      <w:r>
+        <w:rPr>
+          <w:rFonts w:ascii="Arial" w:hAnsi="Arial" w:eastAsia="Arial"/>
+          <w:rtl w:val="true"/>
+        </w:rPr>
+        <w:t xml:space="preserve">שם ניתן לראות את </w:t>
+      </w:r>
+      <w:r>
+        <w:rPr>
+          <w:rFonts w:ascii="Arial" w:hAnsi="Arial" w:eastAsia="Arial"/>
+          <w:rtl w:val="true"/>
+        </w:rPr>
+        <w:t xml:space="preserve">ההתראה </w:t>
+      </w:r>
+      <w:r>
+        <w:rPr>
+          <w:rFonts w:eastAsia="Arial"/>
+          <w:rtl w:val="true"/>
+        </w:rPr>
+        <w:t xml:space="preserve">| </w:t>
+      </w:r>
+      <w:r>
+        <w:rPr>
+          <w:rFonts w:ascii="Arial" w:hAnsi="Arial" w:eastAsia="Arial"/>
+          <w:rtl w:val="true"/>
+        </w:rPr>
+        <w:t>וכל התשובות מאותו מפגש</w:t>
+      </w:r>
+      <w:r>
+        <w:rPr>
+          <w:rFonts w:eastAsia="Arial"/>
+          <w:rtl w:val="true"/>
+        </w:rPr>
+        <w:t>.</w:t>
       </w:r>
     </w:p>
     <w:p>
@@ -3065,7 +3721,70 @@
           <w:rFonts w:ascii="Arial" w:hAnsi="Arial" w:eastAsia="Arial"/>
           <w:rtl w:val="true"/>
         </w:rPr>
-        <w:t xml:space="preserve">בכל מפגש, | המטופל ממלא שוב | דרך אותו קישור | או דרך קישור חדש | שאתם יוצרים.</w:t>
+        <w:t>בכל מפגש</w:t>
+      </w:r>
+      <w:r>
+        <w:rPr>
+          <w:rFonts w:eastAsia="Arial"/>
+          <w:rtl w:val="true"/>
+        </w:rPr>
+        <w:t xml:space="preserve">, | </w:t>
+      </w:r>
+      <w:r>
+        <w:rPr>
+          <w:rFonts w:ascii="Arial" w:hAnsi="Arial" w:eastAsia="Arial"/>
+          <w:rtl w:val="true"/>
+        </w:rPr>
+        <w:t xml:space="preserve">המטופל ממלא שוב </w:t>
+      </w:r>
+      <w:r>
+        <w:rPr>
+          <w:rFonts w:eastAsia="Arial"/>
+          <w:rtl w:val="true"/>
+        </w:rPr>
+        <w:t xml:space="preserve">| </w:t>
+      </w:r>
+      <w:r>
+        <w:rPr>
+          <w:rFonts w:ascii="Arial" w:hAnsi="Arial" w:eastAsia="Arial"/>
+          <w:rtl w:val="true"/>
+        </w:rPr>
+        <w:t xml:space="preserve">דרך אותו קישור </w:t>
+      </w:r>
+      <w:r>
+        <w:rPr>
+          <w:rFonts w:eastAsia="Arial"/>
+          <w:rtl w:val="true"/>
+        </w:rPr>
+        <w:t xml:space="preserve">| </w:t>
+      </w:r>
+      <w:r>
+        <w:rPr>
+          <w:rFonts w:ascii="Arial" w:hAnsi="Arial" w:eastAsia="Arial"/>
+          <w:rtl w:val="true"/>
+        </w:rPr>
+        <w:t xml:space="preserve">או דרך קישור חדש </w:t>
+      </w:r>
+      <w:r>
+        <w:rPr>
+          <w:rFonts w:eastAsia="Arial"/>
+          <w:rtl w:val="true"/>
+        </w:rPr>
+        <w:t xml:space="preserve">| </w:t>
+      </w:r>
+      <w:r>
+        <w:rPr>
+          <w:rFonts w:ascii="Arial" w:hAnsi="Arial" w:eastAsia="Arial"/>
+          <w:rtl w:val="true"/>
+        </w:rPr>
+        <w:t>שאתם יוצרים</w:t>
+      </w:r>
+      <w:r>
+        <w:rPr>
+          <w:rFonts w:eastAsia="Arial"/>
+          <w:rtl w:val="true"/>
+        </w:rPr>
+        <w:t>.</w:t>
       </w:r>
     </w:p>
     <w:p>
@@ -3093,7 +3812,56 @@
           <w:rFonts w:ascii="Arial" w:hAnsi="Arial" w:eastAsia="Arial"/>
           <w:rtl w:val="true"/>
         </w:rPr>
-        <w:t xml:space="preserve">הצבעים מסמנים | את טווחי החומרה, | וכך רואים את ההתקדמות, | שבוע אחר שבוע.</w:t>
+        <w:t xml:space="preserve">הצבעים מסמנים </w:t>
+      </w:r>
+      <w:r>
+        <w:rPr>
+          <w:rFonts w:eastAsia="Arial"/>
+          <w:rtl w:val="true"/>
+        </w:rPr>
+        <w:t xml:space="preserve">| </w:t>
+      </w:r>
+      <w:r>
+        <w:rPr>
+          <w:rFonts w:ascii="Arial" w:hAnsi="Arial" w:eastAsia="Arial"/>
+          <w:rtl w:val="true"/>
+        </w:rPr>
+        <w:t>את טווחי החומרה</w:t>
+      </w:r>
+      <w:r>
+        <w:rPr>
+          <w:rFonts w:eastAsia="Arial"/>
+          <w:rtl w:val="true"/>
+        </w:rPr>
+        <w:t xml:space="preserve">, | </w:t>
+      </w:r>
+      <w:r>
+        <w:rPr>
+          <w:rFonts w:ascii="Arial" w:hAnsi="Arial" w:eastAsia="Arial"/>
+          <w:rtl w:val="true"/>
+        </w:rPr>
+        <w:t>וכך רואים את ההתקדמות</w:t>
+      </w:r>
+      <w:r>
+        <w:rPr>
+          <w:rFonts w:eastAsia="Arial"/>
+          <w:rtl w:val="true"/>
+        </w:rPr>
+        <w:t xml:space="preserve">, | </w:t>
+      </w:r>
+      <w:r>
+        <w:rPr>
+          <w:rFonts w:ascii="Arial" w:hAnsi="Arial" w:eastAsia="Arial"/>
+          <w:rtl w:val="true"/>
+        </w:rPr>
+        <w:t>שבוע אחר שבוע</w:t>
+      </w:r>
+      <w:r>
+        <w:rPr>
+          <w:rFonts w:eastAsia="Arial"/>
+          <w:rtl w:val="true"/>
+        </w:rPr>
+        <w:t>.</w:t>
       </w:r>
     </w:p>
     <w:p>
@@ -3121,7 +3889,98 @@
           <w:rFonts w:ascii="Arial" w:hAnsi="Arial" w:eastAsia="Arial"/>
           <w:rtl w:val="true"/>
         </w:rPr>
-        <w:t xml:space="preserve">מפת פריטים, טבלה | וייצוא לרשומה | תמצאו במדריך המלא.</w:t>
+        <w:t xml:space="preserve">את התוצאות אפשר גם לראות </w:t>
+      </w:r>
+      <w:r>
+        <w:rPr>
+          <w:rFonts w:eastAsia="Arial"/>
+          <w:rtl w:val="true"/>
+        </w:rPr>
+        <w:t xml:space="preserve">| </w:t>
+      </w:r>
+      <w:r>
+        <w:rPr>
+          <w:rFonts w:ascii="Arial" w:hAnsi="Arial" w:eastAsia="Arial"/>
+          <w:rtl w:val="true"/>
+        </w:rPr>
+        <w:t>כ</w:t>
+      </w:r>
+      <w:r>
+        <w:rPr>
+          <w:rFonts w:ascii="Arial" w:hAnsi="Arial" w:eastAsia="Arial"/>
+          <w:rtl w:val="true"/>
+        </w:rPr>
+        <w:t>מפ</w:t>
+      </w:r>
+      <w:r>
+        <w:rPr>
+          <w:rFonts w:ascii="Arial" w:hAnsi="Arial" w:eastAsia="Arial"/>
+          <w:rtl w:val="true"/>
+        </w:rPr>
+        <w:t>ה</w:t>
+      </w:r>
+      <w:r>
+        <w:rPr>
+          <w:rFonts w:ascii="Arial" w:hAnsi="Arial" w:eastAsia="Arial"/>
+          <w:rtl w:val="true"/>
+        </w:rPr>
+        <w:t xml:space="preserve"> </w:t>
+      </w:r>
+      <w:r>
+        <w:rPr>
+          <w:rFonts w:ascii="Arial" w:hAnsi="Arial" w:eastAsia="Arial"/>
+          <w:rtl w:val="true"/>
+        </w:rPr>
+        <w:t>של השינוי ב</w:t>
+      </w:r>
+      <w:r>
+        <w:rPr>
+          <w:rFonts w:ascii="Arial" w:hAnsi="Arial" w:eastAsia="Arial"/>
+          <w:rtl w:val="true"/>
+        </w:rPr>
+        <w:t>פריטים</w:t>
+      </w:r>
+      <w:r>
+        <w:rPr>
+          <w:rFonts w:eastAsia="Arial"/>
+          <w:rtl w:val="true"/>
+        </w:rPr>
+        <w:t xml:space="preserve">, </w:t>
+      </w:r>
+      <w:r>
+        <w:rPr>
+          <w:rFonts w:eastAsia="Arial"/>
+          <w:rtl w:val="true"/>
+        </w:rPr>
+        <w:t xml:space="preserve">| </w:t>
+      </w:r>
+      <w:r>
+        <w:rPr>
+          <w:rFonts w:ascii="Arial" w:hAnsi="Arial" w:eastAsia="Arial"/>
+          <w:rtl w:val="true"/>
+        </w:rPr>
+        <w:t>או כ</w:t>
+      </w:r>
+      <w:r>
+        <w:rPr>
+          <w:rFonts w:ascii="Arial" w:hAnsi="Arial" w:eastAsia="Arial"/>
+          <w:rtl w:val="true"/>
+        </w:rPr>
+        <w:t xml:space="preserve">טבלה </w:t>
+      </w:r>
+      <w:r>
+        <w:rPr>
+          <w:rFonts w:ascii="Arial" w:hAnsi="Arial" w:eastAsia="Arial"/>
+          <w:rtl w:val="true"/>
+        </w:rPr>
+        <w:t>מלאה</w:t>
+      </w:r>
+      <w:r>
+        <w:rPr>
+          <w:rFonts w:eastAsia="Arial"/>
+          <w:rtl w:val="true"/>
+        </w:rPr>
+        <w:t>.</w:t>
       </w:r>
     </w:p>
     <w:p>
@@ -3327,7 +4186,56 @@
           <w:rFonts w:ascii="Arial" w:hAnsi="Arial" w:eastAsia="Arial"/>
           <w:rtl w:val="true"/>
         </w:rPr>
-        <w:t xml:space="preserve">זה כל התהליך: | יוצרים קישור, | המטופל עונה, | והתוצאות מחכות לכם בסיכום.</w:t>
+        <w:t>זה כל התהליך</w:t>
+      </w:r>
+      <w:r>
+        <w:rPr>
+          <w:rFonts w:eastAsia="Arial"/>
+          <w:rtl w:val="true"/>
+        </w:rPr>
+        <w:t xml:space="preserve">: | </w:t>
+      </w:r>
+      <w:r>
+        <w:rPr>
+          <w:rFonts w:ascii="Arial" w:hAnsi="Arial" w:eastAsia="Arial"/>
+          <w:rtl w:val="true"/>
+        </w:rPr>
+        <w:t>יוצרים קישור</w:t>
+      </w:r>
+      <w:r>
+        <w:rPr>
+          <w:rFonts w:eastAsia="Arial"/>
+          <w:rtl w:val="true"/>
+        </w:rPr>
+        <w:t xml:space="preserve">, | </w:t>
+      </w:r>
+      <w:r>
+        <w:rPr>
+          <w:rFonts w:ascii="Arial" w:hAnsi="Arial" w:eastAsia="Arial"/>
+          <w:rtl w:val="true"/>
+        </w:rPr>
+        <w:t>המטופל עונה</w:t>
+      </w:r>
+      <w:r>
+        <w:rPr>
+          <w:rFonts w:eastAsia="Arial"/>
+          <w:rtl w:val="true"/>
+        </w:rPr>
+        <w:t xml:space="preserve">, | </w:t>
+      </w:r>
+      <w:r>
+        <w:rPr>
+          <w:rFonts w:ascii="Arial" w:hAnsi="Arial" w:eastAsia="Arial"/>
+          <w:rtl w:val="true"/>
+        </w:rPr>
+        <w:t>והתוצאות מחכות לכם בסיכום</w:t>
+      </w:r>
+      <w:r>
+        <w:rPr>
+          <w:rFonts w:eastAsia="Arial"/>
+          <w:rtl w:val="true"/>
+        </w:rPr>
+        <w:t>.</w:t>
       </w:r>
     </w:p>
     <w:p>
@@ -3355,7 +4263,42 @@
           <w:rFonts w:ascii="Arial" w:hAnsi="Arial" w:eastAsia="Arial"/>
           <w:rtl w:val="true"/>
         </w:rPr>
-        <w:t xml:space="preserve">כדי להתחיל, | סרקו את הקוד | או היכנסו לכתובת שעל המסך.</w:t>
+        <w:t>כדי להתחיל</w:t>
+      </w:r>
+      <w:r>
+        <w:rPr>
+          <w:rFonts w:eastAsia="Arial"/>
+          <w:rtl w:val="true"/>
+        </w:rPr>
+        <w:t xml:space="preserve">, | </w:t>
+      </w:r>
+      <w:r>
+        <w:rPr>
+          <w:rFonts w:ascii="Arial" w:hAnsi="Arial" w:eastAsia="Arial"/>
+          <w:rtl w:val="true"/>
+        </w:rPr>
+        <w:t xml:space="preserve">סרקו את הקוד </w:t>
+      </w:r>
+      <w:r>
+        <w:rPr>
+          <w:rFonts w:eastAsia="Arial"/>
+          <w:rtl w:val="true"/>
+        </w:rPr>
+        <w:t xml:space="preserve">| </w:t>
+      </w:r>
+      <w:r>
+        <w:rPr>
+          <w:rFonts w:ascii="Arial" w:hAnsi="Arial" w:eastAsia="Arial"/>
+          <w:rtl w:val="true"/>
+        </w:rPr>
+        <w:t>או היכנסו לכתובת שעל המסך</w:t>
+      </w:r>
+      <w:r>
+        <w:rPr>
+          <w:rFonts w:eastAsia="Arial"/>
+          <w:rtl w:val="true"/>
+        </w:rPr>
+        <w:t>.</w:t>
       </w:r>
     </w:p>
     <w:p>
@@ -3448,6 +4391,7 @@
     <w:qFormat/>
     <w:pPr>
       <w:widowControl/>
+      <w:suppressAutoHyphens w:val="true"/>
       <w:bidi w:val="0"/>
       <w:spacing w:lineRule="exact" w:line="300" w:before="0" w:after="100"/>
       <w:jc w:val="left"/>
@@ -3661,6 +4605,7 @@
     <w:qFormat/>
     <w:pPr>
       <w:widowControl/>
+      <w:suppressAutoHyphens w:val="true"/>
       <w:bidi w:val="0"/>
       <w:spacing w:lineRule="exact" w:line="300" w:before="0" w:after="100"/>
       <w:jc w:val="left"/>
@@ -3681,6 +4626,7 @@
     <w:qFormat/>
     <w:pPr>
       <w:widowControl/>
+      <w:suppressAutoHyphens w:val="true"/>
       <w:bidi w:val="0"/>
       <w:spacing w:lineRule="exact" w:line="300" w:before="0" w:after="100"/>
       <w:jc w:val="left"/>
@@ -3732,6 +4678,7 @@
       <w:pBdr>
         <w:right w:val="single" w:sz="18" w:space="8" w:color="77B770"/>
       </w:pBdr>
+      <w:suppressAutoHyphens w:val="true"/>
       <w:bidi w:val="0"/>
       <w:spacing w:lineRule="exact" w:line="360" w:before="60" w:after="160"/>
       <w:ind w:left="360" w:hanging="0"/>
@@ -3751,8 +4698,9 @@
     <w:qFormat/>
     <w:pPr>
       <w:widowControl/>
+      <w:suppressAutoHyphens w:val="true"/>
       <w:bidi w:val="0"/>
-      <w:spacing w:before="120" w:after="40" w:lineRule="exact" w:line="300"/>
+      <w:spacing w:lineRule="exact" w:line="300" w:before="120" w:after="40"/>
       <w:jc w:val="left"/>
     </w:pPr>
     <w:rPr>
@@ -3769,8 +4717,9 @@
     <w:qFormat/>
     <w:pPr>
       <w:widowControl/>
+      <w:suppressAutoHyphens w:val="true"/>
       <w:bidi w:val="0"/>
-      <w:spacing w:before="160" w:after="60" w:lineRule="exact" w:line="300"/>
+      <w:spacing w:lineRule="exact" w:line="300" w:before="160" w:after="60"/>
       <w:jc w:val="left"/>
     </w:pPr>
     <w:rPr>
@@ -3789,8 +4738,9 @@
     <w:qFormat/>
     <w:pPr>
       <w:widowControl/>
+      <w:suppressAutoHyphens w:val="true"/>
       <w:bidi w:val="0"/>
-      <w:spacing w:before="120" w:after="240" w:lineRule="exact" w:line="300"/>
+      <w:spacing w:lineRule="exact" w:line="300" w:before="120" w:after="240"/>
       <w:jc w:val="left"/>
     </w:pPr>
     <w:rPr>

</xml_diff>